<commit_message>
Founding date Nov 2018, reading-days stat, 2021 founding-doc content in fiches
- Site: Since 2018 badge, mission copy, program card dates, 16+ reading
  days stat (5-card impact grid), JSON-LD foundingDate, README
- Fiche Lecture: documented milestones table (2018-2021 vs today),
  sustainability model from 2021 founding doc, relaunch ideas
- Concept note: Askiahub (ex-Kaocen) disclosure in ethics section

Co-Authored-By: Claude Fable 5 <noreply@anthropic.com>
</commit_message>
<xml_diff>
--- a/docs/Fiche-programme-Fonds-Halima-Sante.docx
+++ b/docs/Fiche-programme-Fonds-Halima-Sante.docx
@@ -1043,7 +1043,7 @@
         </w:rPr>
         <w:t xml:space="preserve">Courriel : </w:t>
       </w:r>
-      <w:hyperlink w:history="1" r:id="rIdodpon6yg1aobzk9sqtxk0">
+      <w:hyperlink w:history="1" r:id="rIdykpdfvskrsqyyx5gzqmcp">
         <w:r>
           <w:rPr>
             <w:rStyle w:val="Hyperlink"/>
@@ -1061,7 +1061,7 @@
         </w:rPr>
         <w:t xml:space="preserve">   ·   Site : </w:t>
       </w:r>
-      <w:hyperlink w:history="1" r:id="rIdcr6y95lc7ftbfauigtuko">
+      <w:hyperlink w:history="1" r:id="rIdzfydkvppjqikopogt-u_p">
         <w:r>
           <w:rPr>
             <w:rStyle w:val="Hyperlink"/>

</xml_diff>

<commit_message>
Add cumulative diabetes stat: 50+ people over last two years
Co-Authored-By: Claude Fable 5 <noreply@anthropic.com>
</commit_message>
<xml_diff>
--- a/docs/Fiche-programme-Fonds-Halima-Sante.docx
+++ b/docs/Fiche-programme-Fonds-Halima-Sante.docx
@@ -239,7 +239,7 @@
                 <w:sz w:val="20"/>
                 <w:szCs w:val="20"/>
               </w:rPr>
-              <w:t xml:space="preserve">Zone d’intervention</w:t>
+              <w:t xml:space="preserve">Accompagnées à ce jour</w:t>
             </w:r>
           </w:p>
         </w:tc>
@@ -269,7 +269,7 @@
                 <w:sz w:val="22"/>
                 <w:szCs w:val="22"/>
               </w:rPr>
-              <w:t xml:space="preserve">Niger</w:t>
+              <w:t xml:space="preserve">Plus de 50 personnes sur les deux dernières années</w:t>
             </w:r>
           </w:p>
         </w:tc>
@@ -304,7 +304,7 @@
                 <w:sz w:val="20"/>
                 <w:szCs w:val="20"/>
               </w:rPr>
-              <w:t xml:space="preserve">Statut</w:t>
+              <w:t xml:space="preserve">Zone d’intervention</w:t>
             </w:r>
           </w:p>
         </w:tc>
@@ -334,7 +334,7 @@
                 <w:sz w:val="22"/>
                 <w:szCs w:val="22"/>
               </w:rPr>
-              <w:t xml:space="preserve">Actif — reconduit chaque année</w:t>
+              <w:t xml:space="preserve">Niger</w:t>
             </w:r>
           </w:p>
         </w:tc>
@@ -369,7 +369,7 @@
                 <w:sz w:val="20"/>
                 <w:szCs w:val="20"/>
               </w:rPr>
-              <w:t xml:space="preserve">Financement</w:t>
+              <w:t xml:space="preserve">Statut</w:t>
             </w:r>
           </w:p>
         </w:tc>
@@ -399,7 +399,7 @@
                 <w:sz w:val="22"/>
                 <w:szCs w:val="22"/>
               </w:rPr>
-              <w:t xml:space="preserve">Fonds propres de la famille (à ce jour)</w:t>
+              <w:t xml:space="preserve">Actif — reconduit chaque année</w:t>
             </w:r>
           </w:p>
         </w:tc>
@@ -434,7 +434,7 @@
                 <w:sz w:val="20"/>
                 <w:szCs w:val="20"/>
               </w:rPr>
-              <w:t xml:space="preserve">Origine</w:t>
+              <w:t xml:space="preserve">Financement</w:t>
             </w:r>
           </w:p>
         </w:tc>
@@ -464,7 +464,72 @@
                 <w:sz w:val="22"/>
                 <w:szCs w:val="22"/>
               </w:rPr>
-              <w:t xml:space="preserve">Commemoration de Halima, décédée du diabète en 2005</w:t>
+              <w:t xml:space="preserve">Fonds propres de la famille (à ce jour)</w:t>
+            </w:r>
+          </w:p>
+        </w:tc>
+      </w:tr>
+      <w:tr>
+        <w:tc>
+          <w:tcPr>
+            <w:tcW w:type="dxa" w:w="2800"/>
+            <w:tcBorders>
+              <w:top w:val="single" w:color="D8CFC4" w:sz="1"/>
+              <w:left w:val="single" w:color="D8CFC4" w:sz="1"/>
+              <w:bottom w:val="single" w:color="D8CFC4" w:sz="1"/>
+              <w:right w:val="single" w:color="D8CFC4" w:sz="1"/>
+            </w:tcBorders>
+            <w:shd w:fill="F5F0E8" w:val="clear"/>
+            <w:tcMar>
+              <w:top w:type="dxa" w:w="100"/>
+              <w:left w:type="dxa" w:w="140"/>
+              <w:bottom w:type="dxa" w:w="100"/>
+              <w:right w:type="dxa" w:w="140"/>
+            </w:tcMar>
+          </w:tcPr>
+          <w:p>
+            <w:pPr>
+              <w:spacing w:after="0"/>
+            </w:pPr>
+            <w:r>
+              <w:rPr>
+                <w:b/>
+                <w:bCs/>
+                <w:color w:val="6B5A4E"/>
+                <w:sz w:val="20"/>
+                <w:szCs w:val="20"/>
+              </w:rPr>
+              <w:t xml:space="preserve">Origine</w:t>
+            </w:r>
+          </w:p>
+        </w:tc>
+        <w:tc>
+          <w:tcPr>
+            <w:tcW w:type="dxa" w:w="6272"/>
+            <w:tcBorders>
+              <w:top w:val="single" w:color="D8CFC4" w:sz="1"/>
+              <w:left w:val="single" w:color="D8CFC4" w:sz="1"/>
+              <w:bottom w:val="single" w:color="D8CFC4" w:sz="1"/>
+              <w:right w:val="single" w:color="D8CFC4" w:sz="1"/>
+            </w:tcBorders>
+            <w:tcMar>
+              <w:top w:type="dxa" w:w="100"/>
+              <w:left w:type="dxa" w:w="140"/>
+              <w:bottom w:type="dxa" w:w="100"/>
+              <w:right w:type="dxa" w:w="140"/>
+            </w:tcMar>
+          </w:tcPr>
+          <w:p>
+            <w:pPr>
+              <w:spacing w:after="0"/>
+            </w:pPr>
+            <w:r>
+              <w:rPr>
+                <w:color w:val="2C1810"/>
+                <w:sz w:val="22"/>
+                <w:szCs w:val="22"/>
+              </w:rPr>
+              <w:t xml:space="preserve">Commémoration de Halima, décédée du diabète en 2005</w:t>
             </w:r>
           </w:p>
         </w:tc>
@@ -958,7 +1023,7 @@
           <w:sz w:val="22"/>
           <w:szCs w:val="22"/>
         </w:rPr>
-        <w:t xml:space="preserve">La constance de ce programme est notre meilleur argument auprès des futurs partenaires et bailleurs : une famille qui soutient 20 à 30 personnes chaque année, sur ses fonds propres, démontre un engagement réel. Chaque année doit donc laisser une trace écrite : nombre de bénéficiaires, dépenses, photos datées, reçus. Utiliser le « Modèle de bilan annuel » fourni avec cette fiche, et reconstituer si possible les bilans des années passées.</w:t>
+        <w:t xml:space="preserve">La constance de ce programme est notre meilleur argument auprès des futurs partenaires et bailleurs : une famille qui soutient 20 à 30 personnes chaque année — plus de 50 personnes sur les deux dernières années — sur ses fonds propres, démontre un engagement réel. Chaque année doit donc laisser une trace écrite : nombre de bénéficiaires, dépenses, photos datées, reçus. Utiliser le « Modèle de bilan annuel » fourni avec cette fiche, et reconstituer si possible les bilans des années passées.</w:t>
       </w:r>
     </w:p>
     <w:p>
@@ -1043,7 +1108,7 @@
         </w:rPr>
         <w:t xml:space="preserve">Courriel : </w:t>
       </w:r>
-      <w:hyperlink w:history="1" r:id="rIdykpdfvskrsqyyx5gzqmcp">
+      <w:hyperlink w:history="1" r:id="rIdkovzqrs6txnnhtdrzuczu">
         <w:r>
           <w:rPr>
             <w:rStyle w:val="Hyperlink"/>
@@ -1061,7 +1126,7 @@
         </w:rPr>
         <w:t xml:space="preserve">   ·   Site : </w:t>
       </w:r>
-      <w:hyperlink w:history="1" r:id="rIdzfydkvppjqikopogt-u_p">
+      <w:hyperlink w:history="1" r:id="rIddqr9kel8uj2_0siksti_r">
         <w:r>
           <w:rPr>
             <w:rStyle w:val="Hyperlink"/>

</xml_diff>

<commit_message>
Add draft fiche for tree/plant gifting program (family discussion doc)
Co-Authored-By: Claude Fable 5 <noreply@anthropic.com>
</commit_message>
<xml_diff>
--- a/docs/Fiche-programme-Fonds-Halima-Sante.docx
+++ b/docs/Fiche-programme-Fonds-Halima-Sante.docx
@@ -1108,7 +1108,7 @@
         </w:rPr>
         <w:t xml:space="preserve">Courriel : </w:t>
       </w:r>
-      <w:hyperlink w:history="1" r:id="rId41yvmkoyqwshntfbibyne">
+      <w:hyperlink w:history="1" r:id="rIdkjz5itguagn84gej8syar">
         <w:r>
           <w:rPr>
             <w:rStyle w:val="Hyperlink"/>
@@ -1126,7 +1126,7 @@
         </w:rPr>
         <w:t xml:space="preserve">   ·   Site : </w:t>
       </w:r>
-      <w:hyperlink w:history="1" r:id="rIdeuaixxc4ealy14x6jgmk4">
+      <w:hyperlink w:history="1" r:id="rIdzmg9tvpnrxpl6eliujyvh">
         <w:r>
           <w:rPr>
             <w:rStyle w:val="Hyperlink"/>

</xml_diff>